<commit_message>
Remove academic citations and reference list per assignment guidelines
Co-Authored-By: Claude Fable 5 <noreply@anthropic.com>
Claude-Session: https://claude.ai/code/session_01SLEdWJeTzqGJbSWTzfumWY
</commit_message>
<xml_diff>
--- a/final-assignment/עבודה מסכמת - חוזה בין מורה לסייעת.docx
+++ b/final-assignment/עבודה מסכמת - חוזה בין מורה לסייעת.docx
@@ -358,22 +358,6 @@
     </w:p>
     <w:p>
       <w:pPr>
-        <w:bidi/>
-        <w:spacing w:after="0" w:line="480" w:lineRule="auto"/>
-      </w:pPr>
-      <w:r>
-        <w:rPr>
-          <w:rFonts w:ascii="David" w:cs="David" w:eastAsia="David" w:hAnsi="David"/>
-          <w:b w:val="false"/>
-          <w:sz w:val="24"/>
-          <w:szCs w:val="24"/>
-          <w:rtl/>
-        </w:rPr>
-        <w:t xml:space="preserve">רשימת מקורות</w:t>
-      </w:r>
-    </w:p>
-    <w:p>
-      <w:pPr>
         <w:pageBreakBefore/>
         <w:bidi/>
         <w:spacing w:after="0" w:line="480" w:lineRule="auto"/>
@@ -403,70 +387,23 @@
           <w:szCs w:val="24"/>
           <w:rtl/>
         </w:rPr>
-        <w:t xml:space="preserve">הסייעת היא אשת הצוות שנמצאת לצד הילד יותר שעות מכל מבוגר אחר במסגרת החינוכית, ולמרות זאת תפקידה נותר פעמים רבות ללא הגדרה כתובה. מחקרים שבחנו את עבודתן של סייעות בחינוך המיוחד מצאו שהן פועלות לעיתים קרובות ללא הכוונה שיטתית, וכי נוכחות צמודה מדי לתלמיד עלולה דווקא לצמצם את עצמאותו ואת הקשר שלו עם מוריו ועם בני גילו </w:t>
-      </w:r>
-      <w:r>
-        <w:rPr>
-          <w:rFonts w:ascii="Times New Roman" w:cs="Times New Roman" w:eastAsia="Times New Roman" w:hAnsi="Times New Roman"/>
-          <w:b w:val="false"/>
-          <w:sz w:val="24"/>
-          <w:szCs w:val="24"/>
-        </w:rPr>
-        <w:t xml:space="preserve">(Giangreco et al., 1997). </w:t>
-      </w:r>
-      <w:r>
-        <w:rPr>
-          <w:rFonts w:ascii="David" w:cs="David" w:eastAsia="David" w:hAnsi="David"/>
-          <w:b w:val="false"/>
-          <w:sz w:val="24"/>
-          <w:szCs w:val="24"/>
-          <w:rtl/>
-        </w:rPr>
-        <w:t xml:space="preserve">בישראל התמונה דומה: סייעות מתארות עומס, בדידות מקצועית ותחושה שקולן אינו נשמע בצוות, כפי שעלה גם בחומרי הקורס (סלקובסקי, 2026).</w:t>
-      </w:r>
-    </w:p>
-    <w:p>
-      <w:pPr>
-        <w:bidi/>
-        <w:spacing w:after="0" w:line="480" w:lineRule="auto"/>
-      </w:pPr>
-      <w:r>
-        <w:rPr>
-          <w:rFonts w:ascii="David" w:cs="David" w:eastAsia="David" w:hAnsi="David"/>
-          <w:b w:val="false"/>
-          <w:sz w:val="24"/>
-          <w:szCs w:val="24"/>
-          <w:rtl/>
-        </w:rPr>
-        <w:t xml:space="preserve">ההנחה ששיתוף פעולה בין אנשי צוות נוצר מעצמו, מתוך רצון טוב, היא אחת מן ההנחות שפרינד </w:t>
-      </w:r>
-      <w:r>
-        <w:rPr>
-          <w:rFonts w:ascii="Times New Roman" w:cs="Times New Roman" w:eastAsia="Times New Roman" w:hAnsi="Times New Roman"/>
-          <w:b w:val="false"/>
-          <w:sz w:val="24"/>
-          <w:szCs w:val="24"/>
-        </w:rPr>
-        <w:t xml:space="preserve">(Friend, 2000) </w:t>
-      </w:r>
-      <w:r>
-        <w:rPr>
-          <w:rFonts w:ascii="David" w:cs="David" w:eastAsia="David" w:hAnsi="David"/>
-          <w:b w:val="false"/>
-          <w:sz w:val="24"/>
-          <w:szCs w:val="24"/>
-          <w:rtl/>
-        </w:rPr>
-        <w:t xml:space="preserve">הגדירה כמיתוסים: שיתוף פעולה הוא מיומנות נלמדת, והוא דורש תנאים, זמן ומבנה. ממצא דומה עלה במחקר ישראלי עדכני, שמצא פער בין הערכה מוצהרת של עבודת צוות ובין קושי ממשי לממש אותה בשגרה (גרינבנק, 2022). חוזה כתוב בין מורה לסייעת הוא ניסיון לתת לשיתוף הפעולה מבנה: הוא נחתם בתחילת השנה, בשלב שבו הצוות רק מתגבש והתלות בהגדרות ברורות היא הגבוהה ביותר </w:t>
-      </w:r>
-      <w:r>
-        <w:rPr>
-          <w:rFonts w:ascii="Times New Roman" w:cs="Times New Roman" w:eastAsia="Times New Roman" w:hAnsi="Times New Roman"/>
-          <w:b w:val="false"/>
-          <w:sz w:val="24"/>
-          <w:szCs w:val="24"/>
-        </w:rPr>
-        <w:t xml:space="preserve">(Tuckman, 1965).</w:t>
+        <w:t xml:space="preserve">הסייעת היא אשת הצוות שנמצאת לצד הילד יותר שעות מכל מבוגר אחר במסגרת החינוכית, ולמרות זאת תפקידה נותר פעמים רבות ללא הגדרה כתובה. בפודקאסט על הסייעות שהושמע בקורס תיארו הסייעות עומס, בדידות מקצועית ותחושה שקולן אינו נשמע בצוות. גם נוכחות צמודה מדי לתלמיד עלולה לצמצם את עצמאותו, ולכן הגדרה ברורה של התפקיד חשובה לא רק לצוות אלא גם לילד עצמו.</w:t>
+      </w:r>
+    </w:p>
+    <w:p>
+      <w:pPr>
+        <w:bidi/>
+        <w:spacing w:after="0" w:line="480" w:lineRule="auto"/>
+      </w:pPr>
+      <w:r>
+        <w:rPr>
+          <w:rFonts w:ascii="David" w:cs="David" w:eastAsia="David" w:hAnsi="David"/>
+          <w:b w:val="false"/>
+          <w:sz w:val="24"/>
+          <w:szCs w:val="24"/>
+          <w:rtl/>
+        </w:rPr>
+        <w:t xml:space="preserve">אחד הרעיונות המרכזיים שנלמדו בקורס הוא ששיתוף פעולה בין אנשי צוות אינו נוצר מעצמו, מתוך רצון טוב, אלא דורש תנאים, זמן ומבנה. חוזה כתוב בין מורה לסייעת הוא ניסיון לתת לשיתוף הפעולה מבנה: הוא נחתם בתחילת השנה, בשלב שבו הצוות רק מתגבש והתלות בהגדרות ברורות היא הגבוהה ביותר.</w:t>
       </w:r>
     </w:p>
     <w:p>
@@ -1036,45 +973,7 @@
           <w:szCs w:val="24"/>
           <w:rtl/>
         </w:rPr>
-        <w:t xml:space="preserve">הפער הזה עולה בקנה אחד עם הספרות. סייעות מדווחות על תחושת שקיפות ועל היעדר ערוץ שדרכו הידע שלהן על הילד מגיע אל הצוות (סלקובסקי, 2026), והשאלה אם הצבת סייעת צמודה פותרת בעיה או מסתירה אותה נדונה במחקר כבר שני עשורים </w:t>
-      </w:r>
-      <w:r>
-        <w:rPr>
-          <w:rFonts w:ascii="Times New Roman" w:cs="Times New Roman" w:eastAsia="Times New Roman" w:hAnsi="Times New Roman"/>
-          <w:b w:val="false"/>
-          <w:sz w:val="24"/>
-          <w:szCs w:val="24"/>
-        </w:rPr>
-        <w:t xml:space="preserve">(Giangreco </w:t>
-      </w:r>
-      <w:r>
-        <w:rPr>
-          <w:rFonts w:ascii="David" w:cs="David" w:eastAsia="David" w:hAnsi="David"/>
-          <w:b w:val="false"/>
-          <w:sz w:val="24"/>
-          <w:szCs w:val="24"/>
-          <w:rtl/>
-        </w:rPr>
-        <w:t xml:space="preserve">&amp; </w:t>
-      </w:r>
-      <w:r>
-        <w:rPr>
-          <w:rFonts w:ascii="Times New Roman" w:cs="Times New Roman" w:eastAsia="Times New Roman" w:hAnsi="Times New Roman"/>
-          <w:b w:val="false"/>
-          <w:sz w:val="24"/>
-          <w:szCs w:val="24"/>
-        </w:rPr>
-        <w:t xml:space="preserve">Broer, 2005). </w:t>
-      </w:r>
-      <w:r>
-        <w:rPr>
-          <w:rFonts w:ascii="David" w:cs="David" w:eastAsia="David" w:hAnsi="David"/>
-          <w:b w:val="false"/>
-          <w:sz w:val="24"/>
-          <w:szCs w:val="24"/>
-          <w:rtl/>
-        </w:rPr>
-        <w:t xml:space="preserve">מה שנראה לגננת מובן מאליו, שהסייעת היא חלק מהצוות, אינו מובן מאליו למי שחוותה אחרת. מה שלא כתוב, מבחינת הסייעת, לא קיים.</w:t>
+        <w:t xml:space="preserve">הפער הזה מתחבר לתכנים שנלמדו בקורס. בפודקאסט על הסייעות חזרה שוב ושוב תחושת השקיפות, וההבנה שהידע של הסייעת על הילד אינו מגיע אל הצוות כשאין לו ערוץ מסודר. מה שנראה לגננת מובן מאליו, שהסייעת היא חלק מהצוות, אינו מובן מאליו למי שחוותה אחרת. מה שלא כתוב, מבחינת הסייעת, לא קיים.</w:t>
       </w:r>
     </w:p>
     <w:p>
@@ -1125,26 +1024,7 @@
           <w:szCs w:val="24"/>
           <w:rtl/>
         </w:rPr>
-        <w:t xml:space="preserve">הטיוטה הראשונה נכתבה מתוך כוונה לשותפות, אך נוסחה כרשימת חובות של צד אחד. מבנה כזה מציב את המורה בעמדת המחליטה ואת הסייעת בעמדת המבצעת, תבנית הקרובה לתפקידי המציל והקורבן במשולש הדרמה </w:t>
-      </w:r>
-      <w:r>
-        <w:rPr>
-          <w:rFonts w:ascii="Times New Roman" w:cs="Times New Roman" w:eastAsia="Times New Roman" w:hAnsi="Times New Roman"/>
-          <w:b w:val="false"/>
-          <w:sz w:val="24"/>
-          <w:szCs w:val="24"/>
-        </w:rPr>
-        <w:t xml:space="preserve">(Karpman, 1968): </w:t>
-      </w:r>
-      <w:r>
-        <w:rPr>
-          <w:rFonts w:ascii="David" w:cs="David" w:eastAsia="David" w:hAnsi="David"/>
-          <w:b w:val="false"/>
-          <w:sz w:val="24"/>
-          <w:szCs w:val="24"/>
-          <w:rtl/>
-        </w:rPr>
-        <w:t xml:space="preserve">המורה "מסדירה" עבור הסייעת את עבודתה, והסייעת נותרת פסיבית מול מסמך שנכתב עליה ולא איתה. הדרך לצאת מהתבנית היא הדדיות, כלומר חוזה שבו לכל סעיף יש התחייבות של שני הצדדים.</w:t>
+        <w:t xml:space="preserve">הטיוטה הראשונה נכתבה מתוך כוונה לשותפות, אך נוסחה כרשימת חובות של צד אחד. מבנה כזה מציב את המורה בעמדת המחליטה ואת הסייעת בעמדת המבצעת, תבנית הקרובה לתפקידי המציל והקורבן במשולש הדרמה שנלמד בקורס: המורה "מסדירה" עבור הסייעת את עבודתה, והסייעת נותרת פסיבית מול מסמך שנכתב עליה ולא איתה. הדרך לצאת מהתבנית היא הדדיות, כלומר חוזה שבו לכל סעיף יש התחייבות של שני הצדדים.</w:t>
       </w:r>
     </w:p>
     <w:p>
@@ -1177,26 +1057,7 @@
           <w:szCs w:val="24"/>
           <w:rtl/>
         </w:rPr>
-        <w:t xml:space="preserve">שתי המרואיינות מעריכות עבודת צוות, ובכל זאת שתיהן הצביעו על היעדרם של מנגנונים קטנים: עשר דקות בבוקר, פרוטוקול ברור לרגע משבר. הפער בין הערכה מוצהרת של שיתוף פעולה ובין מימושו בשגרה תואר גם בספרות (גרינבנק, 2022; </w:t>
-      </w:r>
-      <w:r>
-        <w:rPr>
-          <w:rFonts w:ascii="Times New Roman" w:cs="Times New Roman" w:eastAsia="Times New Roman" w:hAnsi="Times New Roman"/>
-          <w:b w:val="false"/>
-          <w:sz w:val="24"/>
-          <w:szCs w:val="24"/>
-        </w:rPr>
-        <w:t xml:space="preserve">Friend, 2000). </w:t>
-      </w:r>
-      <w:r>
-        <w:rPr>
-          <w:rFonts w:ascii="David" w:cs="David" w:eastAsia="David" w:hAnsi="David"/>
-          <w:b w:val="false"/>
-          <w:sz w:val="24"/>
-          <w:szCs w:val="24"/>
-          <w:rtl/>
-        </w:rPr>
-        <w:t xml:space="preserve">המסקנה היישומית: חוזה טוב אינו אוסף עקרונות אלא אוסף מנגנונים, ולכל מנגנון נדרשים זמן, מקום ותדירות.</w:t>
+        <w:t xml:space="preserve">שתי המרואיינות מעריכות עבודת צוות, ובכל זאת שתיהן הצביעו על היעדרם של מנגנונים קטנים: עשר דקות בבוקר, פרוטוקול ברור לרגע משבר. הפער בין הערכה מוצהרת של שיתוף פעולה ובין מימושו בשגרה עלה גם בקורס, בדיון על המיתוסים של עבודת צוות. המסקנה היישומית: חוזה טוב אינו אוסף עקרונות אלא אוסף מנגנונים, ולכל מנגנון נדרשים זמן, מקום ותדירות.</w:t>
       </w:r>
     </w:p>
     <w:p>
@@ -1229,26 +1090,7 @@
           <w:szCs w:val="24"/>
           <w:rtl/>
         </w:rPr>
-        <w:t xml:space="preserve">הסייעת רואה את הילד ברגעים שהמורה אינה רואה: בשער, בשירותים, בחצר. ג'אנגרקו ואחרים </w:t>
-      </w:r>
-      <w:r>
-        <w:rPr>
-          <w:rFonts w:ascii="Times New Roman" w:cs="Times New Roman" w:eastAsia="Times New Roman" w:hAnsi="Times New Roman"/>
-          <w:b w:val="false"/>
-          <w:sz w:val="24"/>
-          <w:szCs w:val="24"/>
-        </w:rPr>
-        <w:t xml:space="preserve">(Giangreco et al., 1997) </w:t>
-      </w:r>
-      <w:r>
-        <w:rPr>
-          <w:rFonts w:ascii="David" w:cs="David" w:eastAsia="David" w:hAnsi="David"/>
-          <w:b w:val="false"/>
-          <w:sz w:val="24"/>
-          <w:szCs w:val="24"/>
-          <w:rtl/>
-        </w:rPr>
-        <w:t xml:space="preserve">הראו שקרבה צמודה של סייעת עלולה לפגוע בעצמאות התלמיד, אך אותה קרבה היא גם מקור המידע העשיר ביותר על תפקודו. הטיוטה הראשונה לא כללה שום מנגנון שמכניס את התצפיות האלה לישיבות הצוות, וכך ידע יקר נשאר אצל מי שאין לה במה להשמיע אותו.</w:t>
+        <w:t xml:space="preserve">הסייעת רואה את הילד ברגעים שהמורה אינה רואה: בשער, בשירותים, בחצר. קרבה צמודה כל כך עלולה לפגוע בעצמאות התלמיד, אבל היא גם מקור המידע העשיר ביותר על תפקודו. הטיוטה הראשונה לא כללה שום מנגנון שמכניס את התצפיות האלה לישיבות הצוות, וכך ידע יקר נשאר אצל מי שאין לה במה להשמיע אותו.</w:t>
       </w:r>
     </w:p>
     <w:p>
@@ -1926,147 +1768,6 @@
           <w:rtl/>
         </w:rPr>
         <w:t xml:space="preserve">למדתי גם דבר מעשי. המשוב לא רק שיפר את החוזה, הוא שינה את מהותו: ממסמך שמגדיר עובדת הוא הפך למסמך שמכונן יחסים. אני מתכוונת להשתמש בכלי הזה בשנה הקרובה, כבר בשבוע הראשון, ובעיקר לשמור על הסדר שלמדתי כאן: קודם טיוטה, אחר כך שיחה אמיתית עם מי שהמסמך נוגע בה, ורק אחר כך נוסח סופי. עצם השיחה על החוזה עשתה למען הקשר יותר מהחוזה עצמו, ואת זה אי אפשר היה ללמוד בלי לעבור את התהליך.</w:t>
-      </w:r>
-    </w:p>
-    <w:p>
-      <w:pPr>
-        <w:pageBreakBefore/>
-        <w:bidi/>
-        <w:spacing w:after="0" w:line="480" w:lineRule="auto"/>
-      </w:pPr>
-      <w:r>
-        <w:rPr>
-          <w:rFonts w:ascii="David" w:cs="David" w:eastAsia="David" w:hAnsi="David"/>
-          <w:b/>
-          <w:bCs/>
-          <w:sz w:val="28"/>
-          <w:szCs w:val="28"/>
-          <w:rtl/>
-        </w:rPr>
-        <w:t xml:space="preserve">רשימת מקורות</w:t>
-      </w:r>
-    </w:p>
-    <w:p>
-      <w:pPr>
-        <w:bidi/>
-        <w:spacing w:line="480" w:lineRule="auto"/>
-        <w:ind w:left="709" w:hanging="709"/>
-      </w:pPr>
-      <w:r>
-        <w:rPr>
-          <w:rFonts w:ascii="David" w:cs="David" w:eastAsia="David" w:hAnsi="David"/>
-          <w:b w:val="false"/>
-          <w:sz w:val="24"/>
-          <w:szCs w:val="24"/>
-          <w:rtl/>
-        </w:rPr>
-        <w:t xml:space="preserve">גרינבנק, א' (2022, 7 בפברואר). "מהי עבודת צוות בעיניי?": עבודת צוות במסגרות חינוכיות בעיניהם של אנשי צוות רב מקצועיים. פסיכולוגיה עברית. </w:t>
-      </w:r>
-      <w:r>
-        <w:rPr>
-          <w:rFonts w:ascii="Times New Roman" w:cs="Times New Roman" w:eastAsia="Times New Roman" w:hAnsi="Times New Roman"/>
-          <w:b w:val="false"/>
-          <w:sz w:val="24"/>
-          <w:szCs w:val="24"/>
-        </w:rPr>
-        <w:t xml:space="preserve">https://www.hebpsy.net/articles.asp?id=4318</w:t>
-      </w:r>
-    </w:p>
-    <w:p>
-      <w:pPr>
-        <w:bidi/>
-        <w:spacing w:line="480" w:lineRule="auto"/>
-        <w:ind w:left="709" w:hanging="709"/>
-      </w:pPr>
-      <w:r>
-        <w:rPr>
-          <w:rFonts w:ascii="David" w:cs="David" w:eastAsia="David" w:hAnsi="David"/>
-          <w:b w:val="false"/>
-          <w:sz w:val="24"/>
-          <w:szCs w:val="24"/>
-          <w:rtl/>
-        </w:rPr>
-        <w:t xml:space="preserve">סלקובסקי, מ' (2026). סייעות בחינוך המיוחד [חומרי קורס]. עבודת צוות רב מקצועי וקשר עם הורים בחנ"מ, הקריה האקדמית אונו.</w:t>
-      </w:r>
-    </w:p>
-    <w:p>
-      <w:pPr>
-        <w:spacing w:line="480" w:lineRule="auto"/>
-        <w:ind w:left="709" w:hanging="709"/>
-        <w:jc w:val="left"/>
-      </w:pPr>
-      <w:r>
-        <w:rPr>
-          <w:rFonts w:ascii="Times New Roman" w:cs="Times New Roman" w:eastAsia="Times New Roman" w:hAnsi="Times New Roman"/>
-          <w:b w:val="false"/>
-          <w:sz w:val="24"/>
-          <w:szCs w:val="24"/>
-        </w:rPr>
-        <w:t xml:space="preserve">Friend, M. (2000). Myths and misunderstandings about professional collaboration. Remedial and Special Education, 21(3), 130-132. https://doi.org/10.1177/074193250002100301</w:t>
-      </w:r>
-    </w:p>
-    <w:p>
-      <w:pPr>
-        <w:spacing w:line="480" w:lineRule="auto"/>
-        <w:ind w:left="709" w:hanging="709"/>
-        <w:jc w:val="left"/>
-      </w:pPr>
-      <w:r>
-        <w:rPr>
-          <w:rFonts w:ascii="Times New Roman" w:cs="Times New Roman" w:eastAsia="Times New Roman" w:hAnsi="Times New Roman"/>
-          <w:b w:val="false"/>
-          <w:sz w:val="24"/>
-          <w:szCs w:val="24"/>
-        </w:rPr>
-        <w:t xml:space="preserve">Giangreco, M. F., &amp; Broer, S. M. (2005). Questionable utilization of paraprofessionals in inclusive schools: Are we addressing symptoms or causes? Focus on Autism and Other Developmental Disabilities, 20(1), 10-26.</w:t>
-      </w:r>
-    </w:p>
-    <w:p>
-      <w:pPr>
-        <w:spacing w:line="480" w:lineRule="auto"/>
-        <w:ind w:left="709" w:hanging="709"/>
-        <w:jc w:val="left"/>
-      </w:pPr>
-      <w:r>
-        <w:rPr>
-          <w:rFonts w:ascii="Times New Roman" w:cs="Times New Roman" w:eastAsia="Times New Roman" w:hAnsi="Times New Roman"/>
-          <w:b w:val="false"/>
-          <w:sz w:val="24"/>
-          <w:szCs w:val="24"/>
-        </w:rPr>
-        <w:t xml:space="preserve">Giangreco, M. F., Edelman, S. W., Luiselli, T. E., &amp; MacFarland, S. Z. C. (1997). Helping or hovering? Effects of instructional assistant proximity on students with disabilities. Exceptional Children, 64(1), 7-18.</w:t>
-      </w:r>
-    </w:p>
-    <w:p>
-      <w:pPr>
-        <w:spacing w:line="480" w:lineRule="auto"/>
-        <w:ind w:left="709" w:hanging="709"/>
-        <w:jc w:val="left"/>
-      </w:pPr>
-      <w:r>
-        <w:rPr>
-          <w:rFonts w:ascii="Times New Roman" w:cs="Times New Roman" w:eastAsia="Times New Roman" w:hAnsi="Times New Roman"/>
-          <w:b w:val="false"/>
-          <w:sz w:val="24"/>
-          <w:szCs w:val="24"/>
-        </w:rPr>
-        <w:t xml:space="preserve">Karpman, S. (1968). Fairy tales and script drama analysis. Transactional Analysis Bulletin, 7(26), 39-43.</w:t>
-      </w:r>
-    </w:p>
-    <w:p>
-      <w:pPr>
-        <w:spacing w:line="480" w:lineRule="auto"/>
-        <w:ind w:left="709" w:hanging="709"/>
-        <w:jc w:val="left"/>
-      </w:pPr>
-      <w:r>
-        <w:rPr>
-          <w:rFonts w:ascii="Times New Roman" w:cs="Times New Roman" w:eastAsia="Times New Roman" w:hAnsi="Times New Roman"/>
-          <w:b w:val="false"/>
-          <w:sz w:val="24"/>
-          <w:szCs w:val="24"/>
-        </w:rPr>
-        <w:t xml:space="preserve">Tuckman, B. W. (1965). Developmental sequence in small groups. Psychological Bulletin, 63(6), 384-399.</w:t>
       </w:r>
     </w:p>
     <w:sectPr>

</xml_diff>

<commit_message>
Expand reflection chapter with links to course content
Co-Authored-By: Claude Fable 5 <noreply@anthropic.com>
Claude-Session: https://claude.ai/code/session_01SLEdWJeTzqGJbSWTzfumWY
</commit_message>
<xml_diff>
--- a/final-assignment/עבודה מסכמת - חוזה בין מורה לסייעת.docx
+++ b/final-assignment/עבודה מסכמת - חוזה בין מורה לסייעת.docx
@@ -1767,7 +1767,39 @@
           <w:szCs w:val="24"/>
           <w:rtl/>
         </w:rPr>
-        <w:t xml:space="preserve">למדתי גם דבר מעשי. המשוב לא רק שיפר את החוזה, הוא שינה את מהותו: ממסמך שמגדיר עובדת הוא הפך למסמך שמכונן יחסים. אני מתכוונת להשתמש בכלי הזה בשנה הקרובה, כבר בשבוע הראשון, ובעיקר לשמור על הסדר שלמדתי כאן: קודם טיוטה, אחר כך שיחה אמיתית עם מי שהמסמך נוגע בה, ורק אחר כך נוסח סופי. עצם השיחה על החוזה עשתה למען הקשר יותר מהחוזה עצמו, ואת זה אי אפשר היה ללמוד בלי לעבור את התהליך.</w:t>
+        <w:t xml:space="preserve">בדיעבד, הטיוטה הראשונה שלי הייתה שיעור חי במשולש הדרמה. בשיעור על המודל זיהיתי את עצמי כמצילה, וחשבתי שההבנה הזאת נשארת בתחום היחסים האישיים. ואז מצאתי אותה בתוך מסמך שכתבתי: חוזה שבו אני מסדירה לסייעת את העבודה, דואגת לה, מגדירה בשבילה, בלי לשאול אותה. זו בדיוק תנועת ההצלה, וצד שמצילים אותו נדחק, כמעט בעל כורחו, לעמדת הקורבן. מה שנלמד בקורס על היציאה מהמשולש, מעבר ליחסים של שני צדדים בוגרים ושווים, הפך אצלי מרעיון תאורטי להחלטת ניסוח: בכל סעיף בגרסה הסופית מתחייבים שני הצדדים.</w:t>
+      </w:r>
+    </w:p>
+    <w:p>
+      <w:pPr>
+        <w:bidi/>
+        <w:spacing w:after="0" w:line="480" w:lineRule="auto"/>
+      </w:pPr>
+      <w:r>
+        <w:rPr>
+          <w:rFonts w:ascii="David" w:cs="David" w:eastAsia="David" w:hAnsi="David"/>
+          <w:b w:val="false"/>
+          <w:sz w:val="24"/>
+          <w:szCs w:val="24"/>
+          <w:rtl/>
+        </w:rPr>
+        <w:t xml:space="preserve">גם הפודקאסט על הסייעות קיבל בתהליך הזה פנים. את המשפטים על שקיפות ועל קול שלא נשמע שמעתי בשיעור ורשמתי במחברת. כששמעתי אותם מפי ש', אישה שעובדת תשע שנים במערכת ומעולם לא נשאלה לדעתה על מסמך שנוגע בה, הם הפסיקו להיות חומר לימוד. הבנתי שהעצמה של סייעת לא מתחילה בהשתלמות ולא בהצהרות, אלא בעשר דקות בבוקר ובשאלה "מה דעתך". השיעור על הגבולות התחבר מהצד השני, באופן שלא ציפיתי לו: חוזה טוב הוא בעצם מסמך של גבולות, כולל הגבולות של הסייעת עצמה. ההפסקה שלה, הזכות שלא להישלח לכיתה אחרת בלי תיאום. גבול כתוב קל להחזיק הרבה יותר מגבול שצריך לריב עליו כל פעם מחדש, וזה נכון גם לגבולות שלי.</w:t>
+      </w:r>
+    </w:p>
+    <w:p>
+      <w:pPr>
+        <w:bidi/>
+        <w:spacing w:after="0" w:line="480" w:lineRule="auto"/>
+      </w:pPr>
+      <w:r>
+        <w:rPr>
+          <w:rFonts w:ascii="David" w:cs="David" w:eastAsia="David" w:hAnsi="David"/>
+          <w:b w:val="false"/>
+          <w:sz w:val="24"/>
+          <w:szCs w:val="24"/>
+          <w:rtl/>
+        </w:rPr>
+        <w:t xml:space="preserve">עד כמה הכלי הזה יהיה שימושי בעבודה שלי? מאוד, אבל לא בגלל המסמך. המשוב לא רק שיפר את החוזה, הוא שינה את מהותו: ממסמך שמגדיר עובדת הוא הפך למסמך שמכונן יחסים. אני מתכוונת להשתמש בו בשנה הקרובה, כבר בשבוע הראשון, ולשמור על הסדר שלמדתי כאן: קודם טיוטה, אחר כך שיחה אמיתית עם מי שהמסמך נוגע בה, ורק אחר כך נוסח סופי. הקורס כולו, משיעור ההורים כשותפים ועד השיעורים על הצוות הרב מקצועי, חוזר בעיניי לנקודה אחת: ציפייה שלא נאמרה בקול אינה הסכם אלא מלכודת. החוזה הוא דרך אחת להגיד את הציפיות בקול, ועצם השיחה עליו עשתה למען הקשר יותר מהחוזה עצמו. את זה אי אפשר היה ללמוד בלי לעבור את התהליך.</w:t>
       </w:r>
     </w:p>
     <w:sectPr>

</xml_diff>

<commit_message>
Expand reflection to seven paragraphs covering more course content
Co-Authored-By: Claude Fable 5 <noreply@anthropic.com>
Claude-Session: https://claude.ai/code/session_01SLEdWJeTzqGJbSWTzfumWY
</commit_message>
<xml_diff>
--- a/final-assignment/עבודה מסכמת - חוזה בין מורה לסייעת.docx
+++ b/final-assignment/עבודה מסכמת - חוזה בין מורה לסייעת.docx
@@ -1751,55 +1751,103 @@
           <w:szCs w:val="24"/>
           <w:rtl/>
         </w:rPr>
-        <w:t xml:space="preserve">נכנסתי לתהליך הזה בטוחה שאני יודעת מה סייעת צריכה. עבדתי לצד סייעות שנים, ישבתי לכתוב את הטיוטה ברצף אחד, והייתי מרוצה ממנה. ואז ש' קראה אותה מולי ואמרה את המשפט על שמונה הסעיפים שכמעט בכולם כתוב "הסייעת תעשה". ישבתי מולה ולא היה לי מה לענות. התכוונתי לכתוב מסמך של שותפות, ויצא לי מסמך של בעלת בית. הרגע הזה לימד אותי על עצמי יותר מכל שיעור: גם כשאני חושבת שאני רואה את האדם שמולי, הניסוח שלי יכול לספר סיפור אחר.</w:t>
-      </w:r>
-    </w:p>
-    <w:p>
-      <w:pPr>
-        <w:bidi/>
-        <w:spacing w:after="0" w:line="480" w:lineRule="auto"/>
-      </w:pPr>
-      <w:r>
-        <w:rPr>
-          <w:rFonts w:ascii="David" w:cs="David" w:eastAsia="David" w:hAnsi="David"/>
-          <w:b w:val="false"/>
-          <w:sz w:val="24"/>
-          <w:szCs w:val="24"/>
-          <w:rtl/>
-        </w:rPr>
-        <w:t xml:space="preserve">בדיעבד, הטיוטה הראשונה שלי הייתה שיעור חי במשולש הדרמה. בשיעור על המודל זיהיתי את עצמי כמצילה, וחשבתי שההבנה הזאת נשארת בתחום היחסים האישיים. ואז מצאתי אותה בתוך מסמך שכתבתי: חוזה שבו אני מסדירה לסייעת את העבודה, דואגת לה, מגדירה בשבילה, בלי לשאול אותה. זו בדיוק תנועת ההצלה, וצד שמצילים אותו נדחק, כמעט בעל כורחו, לעמדת הקורבן. מה שנלמד בקורס על היציאה מהמשולש, מעבר ליחסים של שני צדדים בוגרים ושווים, הפך אצלי מרעיון תאורטי להחלטת ניסוח: בכל סעיף בגרסה הסופית מתחייבים שני הצדדים.</w:t>
-      </w:r>
-    </w:p>
-    <w:p>
-      <w:pPr>
-        <w:bidi/>
-        <w:spacing w:after="0" w:line="480" w:lineRule="auto"/>
-      </w:pPr>
-      <w:r>
-        <w:rPr>
-          <w:rFonts w:ascii="David" w:cs="David" w:eastAsia="David" w:hAnsi="David"/>
-          <w:b w:val="false"/>
-          <w:sz w:val="24"/>
-          <w:szCs w:val="24"/>
-          <w:rtl/>
-        </w:rPr>
-        <w:t xml:space="preserve">גם הפודקאסט על הסייעות קיבל בתהליך הזה פנים. את המשפטים על שקיפות ועל קול שלא נשמע שמעתי בשיעור ורשמתי במחברת. כששמעתי אותם מפי ש', אישה שעובדת תשע שנים במערכת ומעולם לא נשאלה לדעתה על מסמך שנוגע בה, הם הפסיקו להיות חומר לימוד. הבנתי שהעצמה של סייעת לא מתחילה בהשתלמות ולא בהצהרות, אלא בעשר דקות בבוקר ובשאלה "מה דעתך". השיעור על הגבולות התחבר מהצד השני, באופן שלא ציפיתי לו: חוזה טוב הוא בעצם מסמך של גבולות, כולל הגבולות של הסייעת עצמה. ההפסקה שלה, הזכות שלא להישלח לכיתה אחרת בלי תיאום. גבול כתוב קל להחזיק הרבה יותר מגבול שצריך לריב עליו כל פעם מחדש, וזה נכון גם לגבולות שלי.</w:t>
-      </w:r>
-    </w:p>
-    <w:p>
-      <w:pPr>
-        <w:bidi/>
-        <w:spacing w:after="0" w:line="480" w:lineRule="auto"/>
-      </w:pPr>
-      <w:r>
-        <w:rPr>
-          <w:rFonts w:ascii="David" w:cs="David" w:eastAsia="David" w:hAnsi="David"/>
-          <w:b w:val="false"/>
-          <w:sz w:val="24"/>
-          <w:szCs w:val="24"/>
-          <w:rtl/>
-        </w:rPr>
-        <w:t xml:space="preserve">עד כמה הכלי הזה יהיה שימושי בעבודה שלי? מאוד, אבל לא בגלל המסמך. המשוב לא רק שיפר את החוזה, הוא שינה את מהותו: ממסמך שמגדיר עובדת הוא הפך למסמך שמכונן יחסים. אני מתכוונת להשתמש בו בשנה הקרובה, כבר בשבוע הראשון, ולשמור על הסדר שלמדתי כאן: קודם טיוטה, אחר כך שיחה אמיתית עם מי שהמסמך נוגע בה, ורק אחר כך נוסח סופי. הקורס כולו, משיעור ההורים כשותפים ועד השיעורים על הצוות הרב מקצועי, חוזר בעיניי לנקודה אחת: ציפייה שלא נאמרה בקול אינה הסכם אלא מלכודת. החוזה הוא דרך אחת להגיד את הציפיות בקול, ועצם השיחה עליו עשתה למען הקשר יותר מהחוזה עצמו. את זה אי אפשר היה ללמוד בלי לעבור את התהליך.</w:t>
+        <w:t xml:space="preserve">נכנסתי לתהליך הזה בטוחה שאני יודעת מה סייעת צריכה. עבדתי לצד סייעות שנים, ישבתי לכתוב את הטיוטה ברצף אחד, בלי לעצור, והייתי מרוצה ממנה. זכרתי אפילו את התחושה: הנה, סוף סוף מישהי כותבת לסייעת מסמך מסודר. ואז ש' קראה אותה מולי ואמרה את המשפט על שמונה הסעיפים שכמעט בכולם כתוב "הסייעת תעשה". ישבתי מולה ולא היה לי מה לענות. התכוונתי לכתוב מסמך של שותפות, ויצא לי מסמך של בעלת בית. הרגע הזה לימד אותי על עצמי יותר מכל שיעור: גם כשאני חושבת שאני רואה את האדם שמולי, הניסוח שלי יכול לספר סיפור אחר. הכוונה שלי הייתה במקום אחד, והטקסט שלי במקום שני, ורק מי שנמצאת בצד השני של הדף יכולה הייתה להראות לי את זה.</w:t>
+      </w:r>
+    </w:p>
+    <w:p>
+      <w:pPr>
+        <w:bidi/>
+        <w:spacing w:after="0" w:line="480" w:lineRule="auto"/>
+      </w:pPr>
+      <w:r>
+        <w:rPr>
+          <w:rFonts w:ascii="David" w:cs="David" w:eastAsia="David" w:hAnsi="David"/>
+          <w:b w:val="false"/>
+          <w:sz w:val="24"/>
+          <w:szCs w:val="24"/>
+          <w:rtl/>
+        </w:rPr>
+        <w:t xml:space="preserve">בדיעבד, הטיוטה הראשונה שלי הייתה שיעור חי במשולש הדרמה. בשיעור על המודל זיהיתי את עצמי כמצילה, וחשבתי שההבנה הזאת נשארת בתחום היחסים האישיים, בבית ובמשפחה. ואז מצאתי אותה בתוך מסמך מקצועי שכתבתי: חוזה שבו אני מסדירה לסייעת את העבודה, דואגת לה, מגדירה בשבילה, בלי לשאול אותה מילה. זו בדיוק תנועת ההצלה, וצד שמצילים אותו נדחק, כמעט בעל כורחו, לעמדת הקורבן. הבנתי גם למה זה קורה לי: הצלה היא עמדה נוחה. היא נותנת לי להרגיש נדיבה ולשמור על השליטה באותו הזמן, ולכן קשה לוותר עליה. מה שנלמד בקורס על היציאה מהמשולש, מעבר ליחסים של שני צדדים בוגרים ושווים, הפך אצלי מרעיון תאורטי להחלטת ניסוח קונקרטית: בכל סעיף בגרסה הסופית מתחייבים שני הצדדים, ולא רק אחד.</w:t>
+      </w:r>
+    </w:p>
+    <w:p>
+      <w:pPr>
+        <w:bidi/>
+        <w:spacing w:after="0" w:line="480" w:lineRule="auto"/>
+      </w:pPr>
+      <w:r>
+        <w:rPr>
+          <w:rFonts w:ascii="David" w:cs="David" w:eastAsia="David" w:hAnsi="David"/>
+          <w:b w:val="false"/>
+          <w:sz w:val="24"/>
+          <w:szCs w:val="24"/>
+          <w:rtl/>
+        </w:rPr>
+        <w:t xml:space="preserve">גם הפודקאסט על הסייעות קיבל בתהליך הזה פנים. את המשפטים על שקיפות ועל קול שלא נשמע שמעתי בשיעור ורשמתי במחברת, והם נשמעו לי נכונים ורחוקים. כששמעתי אותם מפי ש', אישה שעובדת תשע שנים במערכת ומעולם לא נשאלה לדעתה על מסמך שנוגע בה, הם הפסיקו להיות חומר לימוד. הפער הזה, בין להסכים עם רעיון ובין לפגוש אותו בגוף ראשון, הוא בעיניי מה שהמטלה הזאת עשתה בשבילי. בשיעור התבקשנו לחשוב מה מורה יכולה לעשות אחרת כדי להניע סייעת בצורה מעצימה, וכתבתי אז תשובות כלליות על הערכה והכרה. היום התשובה שלי מדויקת יותר: העצמה לא מתחילה בהשתלמות ולא בהצהרה בישיבת צוות, היא מתחילה בעשר דקות בבוקר ובשאלה "מה דעתך" לפני שהמסמך נסגר. הדבר הקטן הזה עשה יותר מכל סעיף שניסחתי.</w:t>
+      </w:r>
+    </w:p>
+    <w:p>
+      <w:pPr>
+        <w:bidi/>
+        <w:spacing w:after="0" w:line="480" w:lineRule="auto"/>
+      </w:pPr>
+      <w:r>
+        <w:rPr>
+          <w:rFonts w:ascii="David" w:cs="David" w:eastAsia="David" w:hAnsi="David"/>
+          <w:b w:val="false"/>
+          <w:sz w:val="24"/>
+          <w:szCs w:val="24"/>
+          <w:rtl/>
+        </w:rPr>
+        <w:t xml:space="preserve">שיעור הגבולות התחבר לי מהצד שלא ציפיתי לו. הגעתי אליו כמי שחושבת על הגבולות של עצמה, על מה אני מוכנה לקחת על עצמי ומתי אני אומרת די, וכתבתי הבטחה לעצמי. במטלה הזאת ראיתי שחוזה בין מורה לסייעת הוא בעצם מסמך של גבולות לשני הצדדים: ההפסקה של הסייעת, הזכות שלה לא להישלח לכיתה אחרת בלי תיאום, וגם הגבול שלי, ההפרדה בין מה שבאחריותי לבין מה שאני נוטה לקחת על עצמי מתוך הרגל. ש' לא ביקשה ממני יותר סמכות, היא ביקשה שיהיה כתוב מתי היא נחה. גבול כתוב קל להחזיק הרבה יותר מגבול שצריך לריב עליו כל פעם מחדש, וזה נכון לשתי הנשים שחותמות על הדף.</w:t>
+      </w:r>
+    </w:p>
+    <w:p>
+      <w:pPr>
+        <w:bidi/>
+        <w:spacing w:after="0" w:line="480" w:lineRule="auto"/>
+      </w:pPr>
+      <w:r>
+        <w:rPr>
+          <w:rFonts w:ascii="David" w:cs="David" w:eastAsia="David" w:hAnsi="David"/>
+          <w:b w:val="false"/>
+          <w:sz w:val="24"/>
+          <w:szCs w:val="24"/>
+          <w:rtl/>
+        </w:rPr>
+        <w:t xml:space="preserve">דבר נוסף שלמדתי נוגע לתזמון. בקורס דיברנו על שלבי ההתפתחות של צוות ועל כך שהשלב הראשון הוא שלב של אי ודאות, שבו אנשים בוחנים זה את זה ואינם יודעים מה מצופה מהם. נהגתי לחשוב שתיאום ציפיות הוא שיחה שעושים כשמתחילה בעיה. עכשיו ברור לי שזה בדיוק ההפך: השיחה שווה הכי הרבה כשעוד אין על מה לריב, בשבוע הראשון, לפני שנוצרו הרגלים ולפני שנצברו עלבונות קטנים. חוזה שנכתב אחרי משבר הוא כבר מסמך של הסדרת סכסוך, לא של בניית שותפות. וכמו שהגננת אמרה, חוזה שלא נקבע לו מועד עדכון נשאר דף בקלסר, ולכן הכנסתי לגרסה הסופית קריאה מחודשת פעמיים בשנה.</w:t>
+      </w:r>
+    </w:p>
+    <w:p>
+      <w:pPr>
+        <w:bidi/>
+        <w:spacing w:after="0" w:line="480" w:lineRule="auto"/>
+      </w:pPr>
+      <w:r>
+        <w:rPr>
+          <w:rFonts w:ascii="David" w:cs="David" w:eastAsia="David" w:hAnsi="David"/>
+          <w:b w:val="false"/>
+          <w:sz w:val="24"/>
+          <w:szCs w:val="24"/>
+          <w:rtl/>
+        </w:rPr>
+        <w:t xml:space="preserve">היו גם דברים פחות מחמיאים שגיליתי על עצמי. הופתעתי מכמה נעים לי היה לכתוב מסמך שבו כל הסמכויות שלי, וכמה התגוננתי בפנים כשש' שאלה איפה כתוב מה היא מקבלת. המחשבה הראשונה שלי הייתה שהיא לא הבינה את המטרה של החוזה, ורק אחר כך הבנתי שהיא הבינה אותה טוב ממני. אני חושבת שזו נקודת העיוורון הקבועה של מי שמנסחת מסמכים "עבור" מישהי אחרת, ולא נראה לי שהיא נעלמת. מה שכן אפשר זה לבנות סביבה מנגנון: לא לסמוך על כך שאשים לב לבד, אלא להביא כל מסמך כזה לקריאה של מי שהוא נוגע בה, לפני שהוא הופך לסופי. זו בעיניי המסקנה החשובה ביותר מכל התהליך, והיא לא על סייעות אלא עליי.</w:t>
+      </w:r>
+    </w:p>
+    <w:p>
+      <w:pPr>
+        <w:bidi/>
+        <w:spacing w:after="0" w:line="480" w:lineRule="auto"/>
+      </w:pPr>
+      <w:r>
+        <w:rPr>
+          <w:rFonts w:ascii="David" w:cs="David" w:eastAsia="David" w:hAnsi="David"/>
+          <w:b w:val="false"/>
+          <w:sz w:val="24"/>
+          <w:szCs w:val="24"/>
+          <w:rtl/>
+        </w:rPr>
+        <w:t xml:space="preserve">עד כמה הכלי הזה יהיה שימושי בעבודה שלי? מאוד, אבל לא בגלל המסמך. המשוב לא רק שיפר את החוזה, הוא שינה את מהותו: ממסמך שמגדיר עובדת הוא הפך למסמך שמכונן יחסים. אני מתכוונת להשתמש בו בשנה הקרובה, כבר בשבוע הראשון, ולשמור על הסדר שלמדתי כאן: קודם טיוטה, אחר כך שיחה אמיתית עם מי שהמסמך נוגע בה, ורק אחר כך נוסח סופי. אני גם מתכוונת להעביר את אותו סדר למקומות אחרים, ובראשם השיחות עם הורים, שגם בהן למדנו בקורס שהשותפות נבנית לפני ההחלטה ולא אחריה. הקורס כולו, משיעור ההורים כשותפים ועד השיעורים על הצוות הרב מקצועי, חוזר בעיניי לנקודה אחת: ציפייה שלא נאמרה בקול אינה הסכם אלא מלכודת. החוזה הוא דרך אחת להגיד את הציפיות בקול, ועצם השיחה עליו עשתה למען הקשר יותר מהחוזה עצמו. את זה אי אפשר היה ללמוד מקריאה. היה צריך לשבת מול אישה אחת, לתת לה לקרוא דף שכתבתי, ולשמוע מה היא רואה בו.</w:t>
       </w:r>
     </w:p>
     <w:sectPr>

</xml_diff>